<commit_message>
verify fb-595.54.50 generated engines
</commit_message>
<xml_diff>
--- a/courts/first-circuit/maine/state/supreme-judicial-court/amicus-brief/usage/OUTPUT-amicus-brief.docx
+++ b/courts/first-circuit/maine/state/supreme-judicial-court/amicus-brief/usage/OUTPUT-amicus-brief.docx
@@ -13924,7 +13924,7 @@
         <w:pStyle w:val="BodyText"/>
       </w:pPr>
       <w:r>
-        <w:t xml:space="preserve">https://www.courts.maine.gov/​courts/​sjc/​lawcourt/2024/24me002.pdf. As noted above, Bell has not created stability in the law and the vast majority of the public are unaware of the Bell decisions. It is time to restore justice and stability for Maine beach access, and overturn Bell.</w:t>
+        <w:t xml:space="preserve">https://​www.​courts.​maine.​gov/​courts/​sjc/​lawcourt/​2024/​24me002.​pdf. As noted above, Bell has not created stability in the law and the vast majority of the public are unaware of the Bell decisions. It is time to restore justice and stability for Maine beach access, and overturn Bell.</w:t>
       </w:r>
     </w:p>
     <w:p>
@@ -16557,7 +16557,7 @@
         <w:t xml:space="preserve"> </w:t>
       </w:r>
       <w:r>
-        <w:t xml:space="preserve">The Maine Chapter recently collaborated with a local family volunteer group called the “Chickadeeds” for a beach cleanup at Willard Beach where more than 75 children participated. The Chapter has also engaged with China Primary School, teaching students how to collect beach habitat data and document storm erosion. See, https://www.instagram.com/​surfridermaine/</w:t>
+        <w:t xml:space="preserve">The Maine Chapter recently collaborated with a local family volunteer group called the “Chickadeeds” for a beach cleanup at Willard Beach where more than 75 children participated. The Chapter has also engaged with China Primary School, teaching students how to collect beach habitat data and document storm erosion. See, https://​​www.​instagram.​com/​​surfridermaine/</w:t>
       </w:r>
     </w:p>
   </w:footnote>
@@ -16576,7 +16576,7 @@
         <w:t xml:space="preserve"> </w:t>
       </w:r>
       <w:r>
-        <w:t xml:space="preserve">See, https://www.surfrider.org/​pages/​policy-on-beach-access</w:t>
+        <w:t xml:space="preserve">See, https://​​www.​surfrider.​org/​​pages/​​policy-​on-​beach-​access</w:t>
       </w:r>
     </w:p>
   </w:footnote>
@@ -16633,7 +16633,7 @@
         <w:t xml:space="preserve"> </w:t>
       </w:r>
       <w:r>
-        <w:t xml:space="preserve">See https://maine.surfrider.org/​programs/​reusable-bag-accessibility-program and https://maine.surfrider.org/​programs/​reusable-bag-accessibility-program</w:t>
+        <w:t xml:space="preserve">See https://​​maine.​surfrider.​org/​​programs/​​reusable-​bag-​accessibility-​program and https://​​maine.​surfrider.​org/​​programs/​​reusable-​bag-​accessibility-​program</w:t>
       </w:r>
     </w:p>
   </w:footnote>
@@ -17857,7 +17857,7 @@
         <w:t xml:space="preserve"> </w:t>
       </w:r>
       <w:r>
-        <w:t xml:space="preserve">N.A https://www.courts.maine.gov/​courts/​sjc/​lawcourt/2024/24me002.pdf; Adams v. Buffalo Forge</w:t>
+        <w:t xml:space="preserve">N.A https://​​www.​courts.​maine.​gov/​​courts/​​sjc/​​lawcourt/​​2024/​​24me002.​pdf; Adams v. Buffalo Forge</w:t>
       </w:r>
       <w:r>
         <w:t xml:space="preserve"> </w:t>
@@ -17913,7 +17913,7 @@
         <w:t xml:space="preserve"> </w:t>
       </w:r>
       <w:r>
-        <w:t xml:space="preserve">See https://www.surfrider.org/​pages/​policy-on-beach-access</w:t>
+        <w:t xml:space="preserve">See https://​​www.​surfrider.​org/​​pages/​​policy-​on-​beach-​access</w:t>
       </w:r>
     </w:p>
   </w:footnote>
@@ -17932,7 +17932,7 @@
         <w:t xml:space="preserve"> </w:t>
       </w:r>
       <w:r>
-        <w:t xml:space="preserve">See, e.g., https://www.npr.org/2022/09/26/1125054621/​historic-racism-creates-barriers-to-beach-access, https://www.surfrider.org/​news/​understanding-historical-discrimination-in-u.s-beach-access</w:t>
+        <w:t xml:space="preserve">See, e.g., https://​​www.​npr.​org/​​2022/​​09/​​26/​​1125054621/​​historic-​racism-​creates-​barriers-​to-​beach-​access, https://​​www.​surfrider.​org/​​news/​​understanding-​historical-​discrimination-​in-​u.​s-​beach-​access</w:t>
       </w:r>
     </w:p>
   </w:footnote>
@@ -17951,7 +17951,7 @@
         <w:t xml:space="preserve"> </w:t>
       </w:r>
       <w:r>
-        <w:t xml:space="preserve">See, e.g., https://www.webmd.com/​mental-health/​mental-health-benefits-of-the-beach</w:t>
+        <w:t xml:space="preserve">See, e.g., https://​​www.​webmd.​com/​​mental-​health/​​mental-​health-​benefits-​of-​the-​beach</w:t>
       </w:r>
     </w:p>
   </w:footnote>
@@ -18693,6 +18693,7 @@
     <w:unhideWhenUsed/>
     <w:qFormat/>
     <w:pPr>
+      <w:keepLines/>
       <w:spacing w:before="0" w:after="140" w:line="253" w:lineRule="exact"/>
     </w:pPr>
     <w:rPr>

</xml_diff>

<commit_message>
court(me-sjc): second pass on the shared model: gate reply-brief, answering-brief; gate brief-on-the-merits, petition-for-rehearing, petition-for-review with latex reported; record LaTeX dropping a note after a § or ¶ token and two more model requests (fb-595.54.50)
Co-Authored-By: Claude Opus 5.5 <noreply@anthropic.com>
</commit_message>
<xml_diff>
--- a/courts/first-circuit/maine/state/supreme-judicial-court/amicus-brief/usage/OUTPUT-amicus-brief.docx
+++ b/courts/first-circuit/maine/state/supreme-judicial-court/amicus-brief/usage/OUTPUT-amicus-brief.docx
@@ -6015,7 +6015,7 @@
         <w:tab/>
       </w:r>
       <w:r>
-        <w:t xml:space="preserve">9, 19, 20, 21</w:t>
+        <w:t xml:space="preserve">21</w:t>
       </w:r>
     </w:p>
     <w:p>
@@ -7602,7 +7602,7 @@
         <w:tab/>
       </w:r>
       <w:r>
-        <w:t xml:space="preserve">--</w:t>
+        <w:t xml:space="preserve">–</w:t>
       </w:r>
     </w:p>
     <w:p>
@@ -7994,7 +7994,7 @@
         <w:tab/>
       </w:r>
       <w:r>
-        <w:t xml:space="preserve">6, 28, 29</w:t>
+        <w:t xml:space="preserve">28, 29</w:t>
       </w:r>
     </w:p>
     <w:p>
@@ -10073,67 +10073,140 @@
         <w:pStyle w:val="BodyText"/>
       </w:pPr>
       <w:r>
-        <w:t xml:space="preserve">Pursuant to Art. IV, §§ 1</w:t>
+        <w:t xml:space="preserve">Pursuant to Art. IV, §§ 1-⁠3 of the U.S. Constitution, when Maine separated from Massachusetts and entered the Union as an independent state, the 1647 Ordinance was rendered null and void. Maine’s ownership to intertidal zone lands is held by Maine in trust for public trust uses including recreation. Public trust recreational uses are protected from the sea absent a valid alienation by the Maine Legislature for specific parcels of land deemed necessary to facilitate marine commerce (e.g., “wharfing out” which is not applicable in this case). Even the State cannot legislate the transfer of ownership of intertidal lands unless the transfer is limited in the way it adversely impacts public uses and fundamental public trust uses are retained. See,</w:t>
+      </w:r>
+      <w:r>
+        <w:t xml:space="preserve"> </w:t>
+      </w:r>
+      <w:r>
+        <w:rPr>
+          <w:i/>
+          <w:iCs/>
+        </w:rPr>
+        <w:t xml:space="preserve">Illinois Central</w:t>
+      </w:r>
+      <w:r>
+        <w:rPr>
+          <w:i/>
+          <w:iCs/>
+        </w:rPr>
+        <w:t xml:space="preserve"> </w:t>
+      </w:r>
+      <w:r>
+        <w:rPr>
+          <w:i/>
+          <w:iCs/>
+        </w:rPr>
+        <w:t xml:space="preserve">Railroad v. Illinois</w:t>
+      </w:r>
+      <w:r>
+        <w:t xml:space="preserve"> </w:t>
+      </w:r>
+      <w:r>
+        <w:t xml:space="preserve">146 U.S.414,</w:t>
+      </w:r>
+      <w:r>
+        <w:t xml:space="preserve"> </w:t>
+      </w:r>
+      <w:r>
+        <w:rPr>
+          <w:i/>
+          <w:iCs/>
+        </w:rPr>
+        <w:t xml:space="preserve">Phillips Petroleum</w:t>
+      </w:r>
+    </w:p>
+    <w:p>
+      <w:pPr>
+        <w:pStyle w:val="BodyTextNote"/>
+      </w:pPr>
+      <w:r>
+        <w:t xml:space="preserve">The District of Maine did not become part of the Massachusetts Bay Colony until 1692. By its terms, the Ordinance did not apply to the territory that is now Maine, nor did Massachusetts, the legislative body responsible for its enactment, have governing authority over that territory. Moreover, prior to the separation of Maine from Massachusetts the Ordinance</w:t>
+      </w:r>
+      <w:r>
+        <w:t xml:space="preserve"> </w:t>
+      </w:r>
+      <w:r>
+        <w:t xml:space="preserve">“was annulled with the charter by the authority of which it was made.”</w:t>
+      </w:r>
+      <w:r>
+        <w:t xml:space="preserve"> </w:t>
+      </w:r>
+      <w:r>
+        <w:rPr>
+          <w:i/>
+          <w:iCs/>
+        </w:rPr>
+        <w:t xml:space="preserve">Storer v. Freeman</w:t>
+      </w:r>
+      <w:r>
+        <w:t xml:space="preserve">, 6 Mass. 435, 438 (1810). While Storer ruled that the private ownership to the low water mark created by the ordinance was declared part of the common law of Massachusetts (id.), Maine’s addition to the Union ( 1820) ten years later should have settled any and all questions that any grant under the 1647 Colonial Ordinance to upland owners was superseded, and that title to intertidal lands was held by the State in trust for the public to engage in trust uses.</w:t>
+      </w:r>
+      <w:r>
+        <w:rPr>
+          <w:rStyle w:val="FootnoteReference"/>
+        </w:rPr>
+        <w:footnoteReference w:id="23"/>
+      </w:r>
+      <w:r>
+        <w:t xml:space="preserve"> </w:t>
+      </w:r>
+      <w:r>
+        <w:t xml:space="preserve">The continuing applicability of the 1647 Ordinance in Massachusetts is based on the fact that the Massachusetts Legislature ceded title to upland owners after Massachusetts was already a State, Maine never did—a crucial fact that this Court has never adequately addressed in a compelling manner.</w:t>
+      </w:r>
+    </w:p>
+    <w:p>
+      <w:pPr>
+        <w:pStyle w:val="BodyText"/>
+      </w:pPr>
+      <w:r>
+        <w:t xml:space="preserve">The United States Supreme Court has confirmed that state ownership of intertidal lands for public trust uses are superior to and extinguish pre-statehood land grants, deeds, and treaties that, but for Equal Footing doctrine, would vest title in parties that hold facially valid instruments with a perfect chain of title. See</w:t>
+      </w:r>
+      <w:r>
+        <w:t xml:space="preserve"> </w:t>
+      </w:r>
+      <w:r>
+        <w:rPr>
+          <w:i/>
+          <w:iCs/>
+        </w:rPr>
+        <w:t xml:space="preserve">Phillips Petroleum Co. v. Mississippi</w:t>
+      </w:r>
+      <w:r>
+        <w:t xml:space="preserve">, 484 U.S. 469, 472 (1988) (affirming decision that title to intertidal lands vested in the State of Mississippi upon statehood despite petitioners’ record title from pre-statehood Spanish land grants);</w:t>
+      </w:r>
+      <w:r>
+        <w:t xml:space="preserve"> </w:t>
+      </w:r>
+      <w:r>
+        <w:rPr>
+          <w:i/>
+          <w:iCs/>
+        </w:rPr>
+        <w:t xml:space="preserve">Shively v. Bowlby</w:t>
+      </w:r>
+      <w:r>
+        <w:t xml:space="preserve">, 152 U.S. 1, 58 (1894) (finding at common law intertidal lands were held by the king for the benefit of the nation and these rights passed first to the colonies, then to the original states, and then to new states admitted to the Union); Pollard, 44 U.S. at 220</w:t>
       </w:r>
       <w:r>
         <w:noBreakHyphen/>
       </w:r>
       <w:r>
-        <w:t xml:space="preserve">3 of the U.S. Constitution, when Maine separated from Massachusetts and entered the Union as an independent state, the 1647 Ordinance was rendered null and void. Maine’s ownership to intertidal zone lands is held by Maine in trust for public trust uses including recreation. Public trust recreational uses are protected from the sea absent a valid alienation by the Maine Legislature for specific parcels of land deemed necessary to facilitate marine commerce (e.g., “wharfing out” which is not applicable in this case). Even the State cannot legislate the transfer of ownership of intertidal lands unless the transfer is limited in the way it adversely impacts public uses and fundamental public trust uses are retained. See,</w:t>
-      </w:r>
-      <w:r>
-        <w:t xml:space="preserve"> </w:t>
-      </w:r>
-      <w:r>
-        <w:rPr>
-          <w:i/>
-          <w:iCs/>
-        </w:rPr>
-        <w:t xml:space="preserve">Illinois Central</w:t>
-      </w:r>
-      <w:r>
-        <w:rPr>
-          <w:i/>
-          <w:iCs/>
-        </w:rPr>
-        <w:t xml:space="preserve"> </w:t>
-      </w:r>
-      <w:r>
-        <w:rPr>
-          <w:i/>
-          <w:iCs/>
-        </w:rPr>
-        <w:t xml:space="preserve">Railroad v. Illinois</w:t>
-      </w:r>
-      <w:r>
-        <w:t xml:space="preserve"> </w:t>
-      </w:r>
-      <w:r>
-        <w:t xml:space="preserve">146 U.S.414,</w:t>
-      </w:r>
-      <w:r>
-        <w:t xml:space="preserve"> </w:t>
-      </w:r>
-      <w:r>
-        <w:rPr>
-          <w:i/>
-          <w:iCs/>
-        </w:rPr>
-        <w:t xml:space="preserve">Phillips</w:t>
-      </w:r>
-      <w:r>
-        <w:rPr>
-          <w:i/>
-          <w:iCs/>
-        </w:rPr>
-        <w:t xml:space="preserve"> </w:t>
-      </w:r>
-      <w:r>
-        <w:rPr>
-          <w:i/>
-          <w:iCs/>
-        </w:rPr>
-        <w:t xml:space="preserve">Petroleum</w:t>
+        <w:t xml:space="preserve">21 (Alabama was a territory created out of a part of Georgia and the Court held that neither Georgia law nor early Spanish grants took precedence over Alabama’s title to its intertidal lands and its rights).</w:t>
+      </w:r>
+    </w:p>
+    <w:p>
+      <w:pPr>
+        <w:pStyle w:val="BodyText"/>
+      </w:pPr>
+      <w:r>
+        <w:t xml:space="preserve">Deciding that pre-existing deeds, grants, and treaties that transferred title to intertidal lands to private landowners became null and void was necessary to ensuring states joining the Union after the original 12 states, did so on equal terms (the “Equal Footings Doctrine”). Deciding to the contrary violates the U.S. Constitutional principle of state sovereignty. Consequently, states that had been territories and integrated the common law of their parent state upon achieving statehood regained title to intertidal lands for public trust uses. See, e.g., Pollard, 44 U.S. at 228</w:t>
+      </w:r>
+      <w:r>
+        <w:noBreakHyphen/>
+      </w:r>
+      <w:r>
+        <w:t xml:space="preserve">29.</w:t>
       </w:r>
     </w:p>
     <w:p>
@@ -10141,106 +10214,43 @@
         <w:pStyle w:val="BodyTextNote"/>
       </w:pPr>
       <w:r>
-        <w:t xml:space="preserve">The District of Maine did not become part of the Massachusetts Bay Colony until 1692. By its terms, the Ordinance did not apply to the territory that is now Maine, nor did Massachusetts, the legislative body responsible for its enactment, have governing authority over that territory. Moreover, prior to the separation of Maine from Massachusetts the Ordinance</w:t>
-      </w:r>
-      <w:r>
-        <w:t xml:space="preserve"> </w:t>
-      </w:r>
-      <w:r>
-        <w:t xml:space="preserve">“was annulled with the charter by the authority of which it was made.”</w:t>
-      </w:r>
-      <w:r>
-        <w:t xml:space="preserve"> </w:t>
-      </w:r>
-      <w:r>
-        <w:rPr>
-          <w:i/>
-          <w:iCs/>
-        </w:rPr>
-        <w:t xml:space="preserve">Storer v. Freeman</w:t>
-      </w:r>
-      <w:r>
-        <w:t xml:space="preserve">, 6 Mass. 435, 438 (1810). While Storer ruled that the private ownership to the low water mark created by the ordinance was declared part of the common law of Massachusetts (id.), Maine’s addition to the Union ( 1820) ten years later should have settled any and all questions that any grant under the 1647 Colonial Ordinance to upland owners was superseded, and that title to intertidal lands was held by the State in trust for the public to engage in trust uses.</w:t>
+        <w:t xml:space="preserve">In contravention of this body of law, every Maine Law Court decision that has ruled that the Colonial Ordinance divested the State of title to lands the State holds in trust for public uses has been based on blind adherence to the ones before it and each has ignored the fact that only the Maine Legislature has the authority to alienate intertidal lands.</w:t>
       </w:r>
       <w:r>
         <w:rPr>
           <w:rStyle w:val="FootnoteReference"/>
         </w:rPr>
-        <w:footnoteReference w:id="23"/>
-      </w:r>
-      <w:r>
-        <w:t xml:space="preserve"> </w:t>
-      </w:r>
-      <w:r>
-        <w:t xml:space="preserve">The continuing applicability of the 1647 Ordinance in Massachusetts is based on the fact that the Massachusetts Legislature ceded title to upland owners after Massachusetts was already a State, Maine never did—a crucial fact that this Court has never adequately addressed in a compelling manner.</w:t>
-      </w:r>
-    </w:p>
-    <w:p>
-      <w:pPr>
-        <w:pStyle w:val="BodyText"/>
-      </w:pPr>
-      <w:r>
-        <w:t xml:space="preserve">The United States Supreme Court has confirmed that state ownership of intertidal lands for public trust uses are superior to and extinguish pre-statehood land grants, deeds, and treaties that, but for Equal Footing doctrine, would vest title in parties that hold facially valid instruments with a perfect chain of title. See</w:t>
-      </w:r>
-      <w:r>
-        <w:t xml:space="preserve"> </w:t>
-      </w:r>
-      <w:r>
-        <w:rPr>
-          <w:i/>
-          <w:iCs/>
-        </w:rPr>
-        <w:t xml:space="preserve">Phillips</w:t>
-      </w:r>
-      <w:r>
-        <w:rPr>
-          <w:i/>
-          <w:iCs/>
-        </w:rPr>
-        <w:t xml:space="preserve"> </w:t>
-      </w:r>
-      <w:r>
-        <w:rPr>
-          <w:i/>
-          <w:iCs/>
-        </w:rPr>
-        <w:t xml:space="preserve">Petroleum Co. v. Mississippi</w:t>
-      </w:r>
-      <w:r>
-        <w:t xml:space="preserve">, 484 U.S. 469, 472 (1988) (affirming decision that title to intertidal lands vested in the State of Mississippi upon statehood despite petitioners’ record title from pre-statehood Spanish land grants);</w:t>
-      </w:r>
-      <w:r>
-        <w:t xml:space="preserve"> </w:t>
-      </w:r>
-      <w:r>
-        <w:rPr>
-          <w:i/>
-          <w:iCs/>
-        </w:rPr>
-        <w:t xml:space="preserve">Shively v. Bowlby</w:t>
-      </w:r>
-      <w:r>
-        <w:t xml:space="preserve">, 152 U.S. 1, 58 (1894) (finding at common law intertidal lands were held by the king for the benefit of the nation and these rights passed first to the colonies, then to the original states, and then to new states admitted to the Union); Pollard, 44 U.S. at 220</w:t>
-      </w:r>
-      <w:r>
-        <w:noBreakHyphen/>
-      </w:r>
-      <w:r>
-        <w:t xml:space="preserve">21 (Alabama was a territory created out of a part of Georgia and the Court held that neither Georgia law nor early Spanish grants took precedence over Alabama’s title to its intertidal lands and its rights).</w:t>
-      </w:r>
-    </w:p>
-    <w:p>
-      <w:pPr>
-        <w:pStyle w:val="BodyText"/>
-      </w:pPr>
-      <w:r>
-        <w:t xml:space="preserve">Deciding that pre-existing deeds, grants, and treaties that transferred title to intertidal lands to private landowners became null and void was necessary to ensuring states joining the Union after the original 12 states, did so on equal terms (the “Equal Footings Doctrine”). Deciding to the contrary violates the U.S. Constitutional principle of state sovereignty. Consequently, states that had been territories and integrated the common law of their parent state upon achieving statehood regained title to intertidal lands for public trust uses. See, e.g., Pollard, 44 U.S. at 228</w:t>
-      </w:r>
-      <w:r>
-        <w:noBreakHyphen/>
-      </w:r>
-      <w:r>
-        <w:t xml:space="preserve">29.</w:t>
+        <w:footnoteReference w:id="24"/>
+      </w:r>
+      <w:r>
+        <w:t xml:space="preserve"> </w:t>
+      </w:r>
+      <w:r>
+        <w:t xml:space="preserve">Prior Maine cases</w:t>
+      </w:r>
+      <w:r>
+        <w:rPr>
+          <w:rStyle w:val="FootnoteReference"/>
+        </w:rPr>
+        <w:footnoteReference w:id="25"/>
+      </w:r>
+      <w:r>
+        <w:t xml:space="preserve"> </w:t>
+      </w:r>
+      <w:r>
+        <w:t xml:space="preserve">have also ignored the U.S. Constitution, a line of U.S. Supreme Court Cases – every one of which has held that upon the assumption of sovereignty, states hold fee title to the public trust lands</w:t>
+      </w:r>
+      <w:r>
+        <w:rPr>
+          <w:rStyle w:val="FootnoteReference"/>
+        </w:rPr>
+        <w:footnoteReference w:id="26"/>
+      </w:r>
+      <w:r>
+        <w:t xml:space="preserve"> </w:t>
+      </w:r>
+      <w:r>
+        <w:t xml:space="preserve">– and the fact that the adoption of the 1647 Ordinance with respect to intertidal lands was rendered null and void once Maine joined the Union.</w:t>
       </w:r>
     </w:p>
     <w:p>
@@ -10248,81 +10258,25 @@
         <w:pStyle w:val="BodyTextNote"/>
       </w:pPr>
       <w:r>
-        <w:t xml:space="preserve">In contravention of this body of law, every Maine Law Court decision that has ruled that the Colonial Ordinance divested the State of title to lands the State holds in trust for public uses has been based on blind adherence to the ones before it and each has ignored the fact that only the Maine Legislature has the authority to alienate intertidal lands.</w:t>
+        <w:t xml:space="preserve">Maine received title to the intertidal lands to hold for public trust uses when it became a state in 1820 and this Court lacks the authority to give it away to private landowners.</w:t>
       </w:r>
       <w:r>
         <w:rPr>
           <w:rStyle w:val="FootnoteReference"/>
         </w:rPr>
-        <w:footnoteReference w:id="24"/>
-      </w:r>
-      <w:r>
-        <w:t xml:space="preserve"> </w:t>
-      </w:r>
-      <w:r>
-        <w:t xml:space="preserve">Prior Maine cases</w:t>
-      </w:r>
-      <w:r>
-        <w:rPr>
-          <w:rStyle w:val="FootnoteReference"/>
-        </w:rPr>
-        <w:footnoteReference w:id="25"/>
-      </w:r>
-      <w:r>
-        <w:t xml:space="preserve"> </w:t>
-      </w:r>
-      <w:r>
-        <w:t xml:space="preserve">have also ignored the U.S. Constitution, a line of U.S. Supreme Court Cases – every one of which has held that upon the assumption of sovereignty, states hold fee title to the public trust lands</w:t>
-      </w:r>
-      <w:r>
-        <w:rPr>
-          <w:rStyle w:val="FootnoteReference"/>
-        </w:rPr>
-        <w:footnoteReference w:id="26"/>
-      </w:r>
-      <w:r>
-        <w:t xml:space="preserve"> </w:t>
-      </w:r>
-      <w:r>
-        <w:t xml:space="preserve">– and the fact that the adoption of the 1647 Ordinance with respect to intertidal lands was rendered null and void once Maine joined the Union.</w:t>
-      </w:r>
-    </w:p>
-    <w:p>
-      <w:pPr>
-        <w:pStyle w:val="BodyTextNote"/>
-      </w:pPr>
-      <w:r>
-        <w:t xml:space="preserve">Maine received title to the intertidal lands to hold for public trust uses when it became a state in 1820 and this Court lacks the authority to give it away to private landowners.</w:t>
-      </w:r>
-      <w:r>
-        <w:rPr>
-          <w:rStyle w:val="FootnoteReference"/>
-        </w:rPr>
         <w:footnoteReference w:id="27"/>
       </w:r>
       <w:r>
         <w:t xml:space="preserve"> </w:t>
       </w:r>
       <w:r>
-        <w:t xml:space="preserve">Specifically, to transfer title of the intertidal zone would require an act by the Maine Legislature after it had entered the Union. See, 1 M.R.S. § 5. Not only has the Maine Legislature not alienated intertidal lands in favor of private upland owners; Maine has passed legislation that specifically recognizes the State’s ownership of intertidal lands to the highwater mark for the purpose of protecting public trust uses—including recreation. 12 M.R.S. §§ 571</w:t>
-      </w:r>
-      <w:r>
-        <w:noBreakHyphen/>
-      </w:r>
-      <w:r>
-        <w:t xml:space="preserve">573</w:t>
-      </w:r>
-      <w:r>
-        <w:t xml:space="preserve"> </w:t>
-      </w:r>
-      <w:r>
-        <w:t xml:space="preserve">The Public Trust in Intertidal Land Act; 12 M.R.S. §§ 1862</w:t>
-      </w:r>
-      <w:r>
-        <w:noBreakHyphen/>
-      </w:r>
-      <w:r>
-        <w:t xml:space="preserve">1865 Submerged and Intertidal Lands;</w:t>
+        <w:t xml:space="preserve">Specifically, to transfer title of the intertidal zone would require an act by the Maine Legislature after it had entered the Union. See, 1 M.R.S. § 5. Not only has the Maine Legislature not alienated intertidal lands in favor of private upland owners; Maine has passed legislation that specifically recognizes the State’s ownership of intertidal lands to the highwater mark for the purpose of protecting public trust uses—including recreation. 12 M.R.S. §§ 571-⁠573</w:t>
+      </w:r>
+      <w:r>
+        <w:t xml:space="preserve"> </w:t>
+      </w:r>
+      <w:r>
+        <w:t xml:space="preserve">The Public Trust in Intertidal Land Act; 12 M.R.S. §§ 1862-⁠1865 Submerged and Intertidal Lands;</w:t>
       </w:r>
       <w:r>
         <w:t xml:space="preserve"> </w:t>
@@ -11380,7 +11334,7 @@
         <w:t xml:space="preserve">City of Hawaii v. Sotomura</w:t>
       </w:r>
       <w:r>
-        <w:t xml:space="preserve">, 517 P.2d 57, 61 (1973) (explaining that the “long-standing public use of Hawaii’s beaches . . . has ripened into a customary right.”</w:t>
+        <w:t xml:space="preserve">, 517 P.2d 57, 61 (1973) (explaining that the “long-standing public use of Hawaii’s beaches . . . has ripened into a customary right.”</w:t>
       </w:r>
       <w:r>
         <w:t xml:space="preserve"> </w:t>
@@ -11455,13 +11409,7 @@
         <w:pStyle w:val="BodyText"/>
       </w:pPr>
       <w:r>
-        <w:t xml:space="preserve">See, 9 Haw. Rev. Stat. § 115</w:t>
-      </w:r>
-      <w:r>
-        <w:noBreakHyphen/>
-      </w:r>
-      <w:r>
-        <w:t xml:space="preserve">10</w:t>
+        <w:t xml:space="preserve">See, 9 Haw. Rev. Stat. § 115-⁠10</w:t>
       </w:r>
       <w:r>
         <w:t xml:space="preserve"> </w:t>
@@ -11615,7 +11563,7 @@
         <w:pStyle w:val="XdQuoteFirst"/>
       </w:pPr>
       <w:r>
-        <w:t xml:space="preserve">The legislature further finds and declares that the basic goals of the state for the coastal zone are to: . . .(c) Maximize public access to and along the coast and maximize public recreational opportunities in the coastal zone consistent with sound resources conservation principles and constitutionally protected rights of private property owners.</w:t>
+        <w:t xml:space="preserve">The legislature further finds and declares that the basic goals of the state for the coastal zone are to: . . .(c) Maximize public access to and along the coast and maximize public recreational opportunities in the coastal zone consistent with sound resources conservation principles and constitutionally protected rights of private property owners.</w:t>
       </w:r>
     </w:p>
     <w:p>
@@ -16217,13 +16165,7 @@
         <w:t xml:space="preserve"> </w:t>
       </w:r>
       <w:r>
-        <w:t xml:space="preserve">§§ 1</w:t>
-      </w:r>
-      <w:r>
-        <w:noBreakHyphen/>
-      </w:r>
-      <w:r>
-        <w:t xml:space="preserve">3.</w:t>
+        <w:t xml:space="preserve">§§ 1-⁠3.</w:t>
       </w:r>
     </w:p>
   </w:footnote>
@@ -16279,21 +16221,7 @@
           <w:i/>
           <w:iCs/>
         </w:rPr>
-        <w:t xml:space="preserve">Phillips</w:t>
-      </w:r>
-      <w:r>
-        <w:rPr>
-          <w:i/>
-          <w:iCs/>
-        </w:rPr>
-        <w:t xml:space="preserve"> </w:t>
-      </w:r>
-      <w:r>
-        <w:rPr>
-          <w:i/>
-          <w:iCs/>
-        </w:rPr>
-        <w:t xml:space="preserve">Petroleum Co. v. Mississippi</w:t>
+        <w:t xml:space="preserve">Phillips Petroleum Co. v. Mississippi</w:t>
       </w:r>
       <w:r>
         <w:t xml:space="preserve">, 484 U.S. 469, 472 (1988);</w:t>
@@ -16526,7 +16454,7 @@
         <w:t xml:space="preserve"> </w:t>
       </w:r>
       <w:r>
-        <w:t xml:space="preserve">793 S.E. 2d 699 (N.C. 2016; Brannon v. State of Texas , N.O. 01</w:t>
+        <w:t xml:space="preserve">793 S.E. 2d 699 (N.C. 2016; Brannon v. State of Texas , N.O. 01</w:t>
       </w:r>
       <w:r>
         <w:noBreakHyphen/>
@@ -16557,7 +16485,7 @@
         <w:t xml:space="preserve"> </w:t>
       </w:r>
       <w:r>
-        <w:t xml:space="preserve">The Maine Chapter recently collaborated with a local family volunteer group called the “Chickadeeds” for a beach cleanup at Willard Beach where more than 75 children participated. The Chapter has also engaged with China Primary School, teaching students how to collect beach habitat data and document storm erosion. See, https://​​www.​instagram.​com/​​surfridermaine/</w:t>
+        <w:t xml:space="preserve">The Maine Chapter recently collaborated with a local family volunteer group called the “Chickadeeds” for a beach cleanup at Willard Beach where more than 75 children participated. The Chapter has also engaged with China Primary School, teaching students how to collect beach habitat data and document storm erosion. See, https://​www.​instagram.​com/​surfridermaine/</w:t>
       </w:r>
     </w:p>
   </w:footnote>
@@ -16576,7 +16504,7 @@
         <w:t xml:space="preserve"> </w:t>
       </w:r>
       <w:r>
-        <w:t xml:space="preserve">See, https://​​www.​surfrider.​org/​​pages/​​policy-​on-​beach-​access</w:t>
+        <w:t xml:space="preserve">See, https://​www.​surfrider.​org/​pages/​policy-​on-​beach-​access</w:t>
       </w:r>
     </w:p>
   </w:footnote>
@@ -16633,7 +16561,7 @@
         <w:t xml:space="preserve"> </w:t>
       </w:r>
       <w:r>
-        <w:t xml:space="preserve">See https://​​maine.​surfrider.​org/​​programs/​​reusable-​bag-​accessibility-​program and https://​​maine.​surfrider.​org/​​programs/​​reusable-​bag-​accessibility-​program</w:t>
+        <w:t xml:space="preserve">See https://​maine.​surfrider.​org/​programs/​reusable-​bag-​accessibility-​program and https://​maine.​surfrider.​org/​programs/​reusable-​bag-​accessibility-​program</w:t>
       </w:r>
     </w:p>
   </w:footnote>
@@ -17402,13 +17330,7 @@
         <w:t xml:space="preserve"> </w:t>
       </w:r>
       <w:r>
-        <w:t xml:space="preserve">§ 1</w:t>
-      </w:r>
-      <w:r>
-        <w:noBreakHyphen/>
-      </w:r>
-      <w:r>
-        <w:t xml:space="preserve">45.1 (1994))).</w:t>
+        <w:t xml:space="preserve">§ 1-⁠45.1 (1994))).</w:t>
       </w:r>
     </w:p>
   </w:footnote>
@@ -17458,13 +17380,7 @@
         <w:t xml:space="preserve"> </w:t>
       </w:r>
       <w:r>
-        <w:t xml:space="preserve">§ 1</w:t>
-      </w:r>
-      <w:r>
-        <w:noBreakHyphen/>
-      </w:r>
-      <w:r>
-        <w:t xml:space="preserve">45.1 (1994).</w:t>
+        <w:t xml:space="preserve">§ 1-⁠45.1 (1994).</w:t>
       </w:r>
     </w:p>
   </w:footnote>
@@ -17764,19 +17680,7 @@
         <w:t xml:space="preserve"> </w:t>
       </w:r>
       <w:r>
-        <w:t xml:space="preserve">§ 46</w:t>
-      </w:r>
-      <w:r>
-        <w:noBreakHyphen/>
-      </w:r>
-      <w:r>
-        <w:t xml:space="preserve">23</w:t>
-      </w:r>
-      <w:r>
-        <w:noBreakHyphen/>
-      </w:r>
-      <w:r>
-        <w:t xml:space="preserve">1.</w:t>
+        <w:t xml:space="preserve">§ 46-⁠23-⁠1.</w:t>
       </w:r>
     </w:p>
   </w:footnote>
@@ -17857,7 +17761,7 @@
         <w:t xml:space="preserve"> </w:t>
       </w:r>
       <w:r>
-        <w:t xml:space="preserve">N.A https://​​www.​courts.​maine.​gov/​​courts/​​sjc/​​lawcourt/​​2024/​​24me002.​pdf; Adams v. Buffalo Forge</w:t>
+        <w:t xml:space="preserve">N.A https://​www.​courts.​maine.​gov/​courts/​sjc/​lawcourt/​2024/​24me002.​pdf; Adams v. Buffalo Forge</w:t>
       </w:r>
       <w:r>
         <w:t xml:space="preserve"> </w:t>
@@ -17913,7 +17817,7 @@
         <w:t xml:space="preserve"> </w:t>
       </w:r>
       <w:r>
-        <w:t xml:space="preserve">See https://​​www.​surfrider.​org/​​pages/​​policy-​on-​beach-​access</w:t>
+        <w:t xml:space="preserve">See https://​www.​surfrider.​org/​pages/​policy-​on-​beach-​access</w:t>
       </w:r>
     </w:p>
   </w:footnote>
@@ -17932,7 +17836,7 @@
         <w:t xml:space="preserve"> </w:t>
       </w:r>
       <w:r>
-        <w:t xml:space="preserve">See, e.g., https://​​www.​npr.​org/​​2022/​​09/​​26/​​1125054621/​​historic-​racism-​creates-​barriers-​to-​beach-​access, https://​​www.​surfrider.​org/​​news/​​understanding-​historical-​discrimination-​in-​u.​s-​beach-​access</w:t>
+        <w:t xml:space="preserve">See, e.g., https://​www.​npr.​org/​2022/​09/​26/​1125054621/​historic-​racism-​creates-​barriers-​to-​beach-​access, https://​www.​surfrider.​org/​news/​understanding-​historical-​discrimination-​in-​u.​s-​beach-​access</w:t>
       </w:r>
     </w:p>
   </w:footnote>
@@ -17951,7 +17855,7 @@
         <w:t xml:space="preserve"> </w:t>
       </w:r>
       <w:r>
-        <w:t xml:space="preserve">See, e.g., https://​​www.​webmd.​com/​​mental-​health/​​mental-​health-​benefits-​of-​the-​beach</w:t>
+        <w:t xml:space="preserve">See, e.g., https://​www.​webmd.​com/​mental-​health/​mental-​health-​benefits-​of-​the-​beach</w:t>
       </w:r>
     </w:p>
   </w:footnote>
@@ -18946,6 +18850,33 @@
       <w:ind w:left="2160" w:hanging="720"/>
     </w:pPr>
   </w:style>
+  <w:style w:type="paragraph" w:customStyle="1" w:styleId="XdQuoteList1">
+    <w:name w:val="Xd Quote List 1"/>
+    <w:basedOn w:val="Normal"/>
+    <w:qFormat/>
+    <w:pPr>
+      <w:spacing w:before="0" w:after="0" w:line="322" w:lineRule="exact"/>
+      <w:ind w:left="1440" w:right="720" w:hanging="720"/>
+    </w:pPr>
+  </w:style>
+  <w:style w:type="paragraph" w:customStyle="1" w:styleId="XdQuoteList2">
+    <w:name w:val="Xd Quote List 2"/>
+    <w:basedOn w:val="Normal"/>
+    <w:qFormat/>
+    <w:pPr>
+      <w:spacing w:before="0" w:after="0" w:line="322" w:lineRule="exact"/>
+      <w:ind w:left="2160" w:right="720" w:hanging="720"/>
+    </w:pPr>
+  </w:style>
+  <w:style w:type="paragraph" w:customStyle="1" w:styleId="XdQuoteList3">
+    <w:name w:val="Xd Quote List 3"/>
+    <w:basedOn w:val="Normal"/>
+    <w:qFormat/>
+    <w:pPr>
+      <w:spacing w:before="0" w:after="0" w:line="322" w:lineRule="exact"/>
+      <w:ind w:left="2880" w:right="720" w:hanging="720"/>
+    </w:pPr>
+  </w:style>
   <w:style w:type="paragraph" w:customStyle="1" w:styleId="XdList1">
     <w:name w:val="XdList1"/>
     <w:basedOn w:val="BodyText"/>

</xml_diff>

<commit_message>
maine sjc: petition-for-rehearing, petition-for-review and brief-on-the-merits (latex_bias 0.075) gated on every engine, motion-brief on latex; amicus-brief docx_bias 0.05, still reported for typst's stranded heading (fb-595.54.50)
Co-Authored-By: Claude Opus 5.5 <noreply@anthropic.com>
</commit_message>
<xml_diff>
--- a/courts/first-circuit/maine/state/supreme-judicial-court/amicus-brief/usage/OUTPUT-amicus-brief.docx
+++ b/courts/first-circuit/maine/state/supreme-judicial-court/amicus-brief/usage/OUTPUT-amicus-brief.docx
@@ -489,7 +489,7 @@
     </w:p>
     <w:tbl>
       <w:tblPr>
-        <w:tblW w:w="9360" w:type="dxa"/>
+        <w:tblW w:w="9359" w:type="dxa"/>
         <w:tblLayout w:type="fixed"/>
         <w:tblCellMar>
           <w:top w:w="0" w:type="dxa"/>
@@ -500,7 +500,7 @@
         <w:tblLook w:val="0000" w:firstRow="0" w:lastRow="0" w:firstColumn="0" w:lastColumn="0" w:noHBand="0" w:noVBand="0"/>
       </w:tblPr>
       <w:tblGrid>
-        <w:gridCol w:w="9360"/>
+        <w:gridCol w:w="9359"/>
       </w:tblGrid>
       <w:tr>
         <w:trPr>
@@ -508,7 +508,7 @@
         </w:trPr>
         <w:tc>
           <w:tcPr>
-            <w:tcW w:w="9360" w:type="dxa"/>
+            <w:tcW w:w="9359" w:type="dxa"/>
           </w:tcPr>
           <w:p>
             <w:pPr>
@@ -841,7 +841,7 @@
       <w:pPr>
         <w:keepLines/>
         <w:tabs>
-          <w:tab w:val="right" w:leader="dot" w:pos="9360"/>
+          <w:tab w:val="right" w:leader="dot" w:pos="9359"/>
         </w:tabs>
         <w:spacing w:before="144" w:after="0" w:line="322" w:lineRule="exact"/>
         <w:ind w:left="360" w:right="720" w:hanging="360"/>
@@ -905,7 +905,7 @@
       <w:pPr>
         <w:keepLines/>
         <w:tabs>
-          <w:tab w:val="right" w:leader="dot" w:pos="9360"/>
+          <w:tab w:val="right" w:leader="dot" w:pos="9359"/>
         </w:tabs>
         <w:spacing w:before="144" w:after="0" w:line="322" w:lineRule="exact"/>
         <w:ind w:left="360" w:right="720" w:hanging="360"/>
@@ -939,7 +939,7 @@
       <w:pPr>
         <w:keepLines/>
         <w:tabs>
-          <w:tab w:val="right" w:leader="dot" w:pos="9360"/>
+          <w:tab w:val="right" w:leader="dot" w:pos="9359"/>
         </w:tabs>
         <w:spacing w:before="144" w:after="0" w:line="322" w:lineRule="exact"/>
         <w:ind w:left="360" w:right="720" w:hanging="360"/>
@@ -973,7 +973,7 @@
       <w:pPr>
         <w:keepLines/>
         <w:tabs>
-          <w:tab w:val="right" w:leader="dot" w:pos="9360"/>
+          <w:tab w:val="right" w:leader="dot" w:pos="9359"/>
         </w:tabs>
         <w:spacing w:before="144" w:after="0" w:line="322" w:lineRule="exact"/>
         <w:ind w:left="360" w:right="720" w:hanging="360"/>
@@ -1007,7 +1007,7 @@
       <w:pPr>
         <w:keepLines/>
         <w:tabs>
-          <w:tab w:val="right" w:leader="dot" w:pos="9360"/>
+          <w:tab w:val="right" w:leader="dot" w:pos="9359"/>
         </w:tabs>
         <w:spacing w:before="144" w:after="0" w:line="322" w:lineRule="exact"/>
         <w:ind w:left="360" w:right="720" w:hanging="360"/>
@@ -1035,7 +1035,7 @@
       <w:pPr>
         <w:keepLines/>
         <w:tabs>
-          <w:tab w:val="right" w:leader="dot" w:pos="9360"/>
+          <w:tab w:val="right" w:leader="dot" w:pos="9359"/>
         </w:tabs>
         <w:spacing w:before="144" w:after="0" w:line="322" w:lineRule="exact"/>
         <w:ind w:left="360" w:right="720" w:hanging="360"/>
@@ -1057,7 +1057,7 @@
       <w:pPr>
         <w:keepLines/>
         <w:tabs>
-          <w:tab w:val="right" w:leader="dot" w:pos="9360"/>
+          <w:tab w:val="right" w:leader="dot" w:pos="9359"/>
         </w:tabs>
         <w:spacing w:before="144" w:after="0" w:line="322" w:lineRule="exact"/>
         <w:ind w:left="720" w:right="720" w:hanging="360"/>
@@ -1121,7 +1121,7 @@
       <w:pPr>
         <w:keepLines/>
         <w:tabs>
-          <w:tab w:val="right" w:leader="dot" w:pos="9360"/>
+          <w:tab w:val="right" w:leader="dot" w:pos="9359"/>
         </w:tabs>
         <w:spacing w:before="144" w:after="0" w:line="322" w:lineRule="exact"/>
         <w:ind w:left="720" w:right="720" w:hanging="360"/>
@@ -1509,7 +1509,7 @@
       <w:pPr>
         <w:keepLines/>
         <w:tabs>
-          <w:tab w:val="right" w:leader="dot" w:pos="9360"/>
+          <w:tab w:val="right" w:leader="dot" w:pos="9359"/>
         </w:tabs>
         <w:spacing w:before="144" w:after="0" w:line="322" w:lineRule="exact"/>
         <w:ind w:left="720" w:right="720" w:hanging="360"/>
@@ -1879,7 +1879,7 @@
       <w:pPr>
         <w:keepLines/>
         <w:tabs>
-          <w:tab w:val="right" w:leader="dot" w:pos="9360"/>
+          <w:tab w:val="right" w:leader="dot" w:pos="9359"/>
         </w:tabs>
         <w:spacing w:before="144" w:after="0" w:line="322" w:lineRule="exact"/>
         <w:ind w:left="720" w:right="720" w:hanging="360"/>
@@ -2003,7 +2003,7 @@
       <w:pPr>
         <w:keepLines/>
         <w:tabs>
-          <w:tab w:val="right" w:leader="dot" w:pos="9360"/>
+          <w:tab w:val="right" w:leader="dot" w:pos="9359"/>
         </w:tabs>
         <w:spacing w:before="144" w:after="0" w:line="322" w:lineRule="exact"/>
         <w:ind w:left="360" w:right="720" w:hanging="360"/>
@@ -2091,7 +2091,7 @@
       <w:pPr>
         <w:keepLines/>
         <w:tabs>
-          <w:tab w:val="right" w:leader="dot" w:pos="9360"/>
+          <w:tab w:val="right" w:leader="dot" w:pos="9359"/>
         </w:tabs>
         <w:spacing w:before="144" w:after="0" w:line="322" w:lineRule="exact"/>
         <w:ind w:left="576" w:right="1440" w:hanging="576"/>
@@ -2212,7 +2212,7 @@
       <w:pPr>
         <w:keepLines/>
         <w:tabs>
-          <w:tab w:val="right" w:leader="dot" w:pos="9360"/>
+          <w:tab w:val="right" w:leader="dot" w:pos="9359"/>
         </w:tabs>
         <w:spacing w:before="144" w:after="0" w:line="322" w:lineRule="exact"/>
         <w:ind w:left="576" w:right="1440" w:hanging="576"/>
@@ -2327,7 +2327,7 @@
       <w:pPr>
         <w:keepLines/>
         <w:tabs>
-          <w:tab w:val="right" w:leader="dot" w:pos="9360"/>
+          <w:tab w:val="right" w:leader="dot" w:pos="9359"/>
         </w:tabs>
         <w:spacing w:before="144" w:after="0" w:line="322" w:lineRule="exact"/>
         <w:ind w:left="576" w:right="1440" w:hanging="576"/>
@@ -2448,7 +2448,7 @@
       <w:pPr>
         <w:keepLines/>
         <w:tabs>
-          <w:tab w:val="right" w:leader="dot" w:pos="9360"/>
+          <w:tab w:val="right" w:leader="dot" w:pos="9359"/>
         </w:tabs>
         <w:spacing w:before="144" w:after="0" w:line="322" w:lineRule="exact"/>
         <w:ind w:left="576" w:right="1440" w:hanging="576"/>
@@ -2535,7 +2535,7 @@
       <w:pPr>
         <w:keepLines/>
         <w:tabs>
-          <w:tab w:val="right" w:leader="dot" w:pos="9360"/>
+          <w:tab w:val="right" w:leader="dot" w:pos="9359"/>
         </w:tabs>
         <w:spacing w:before="144" w:after="0" w:line="322" w:lineRule="exact"/>
         <w:ind w:left="576" w:right="1440" w:hanging="576"/>
@@ -2678,7 +2678,7 @@
       <w:pPr>
         <w:keepLines/>
         <w:tabs>
-          <w:tab w:val="right" w:leader="dot" w:pos="9360"/>
+          <w:tab w:val="right" w:leader="dot" w:pos="9359"/>
         </w:tabs>
         <w:spacing w:before="144" w:after="0" w:line="322" w:lineRule="exact"/>
         <w:ind w:left="576" w:right="1440" w:hanging="576"/>
@@ -2821,7 +2821,7 @@
       <w:pPr>
         <w:keepLines/>
         <w:tabs>
-          <w:tab w:val="right" w:leader="dot" w:pos="9360"/>
+          <w:tab w:val="right" w:leader="dot" w:pos="9359"/>
         </w:tabs>
         <w:spacing w:before="144" w:after="0" w:line="322" w:lineRule="exact"/>
         <w:ind w:left="576" w:right="1440" w:hanging="576"/>
@@ -2984,7 +2984,7 @@
       <w:pPr>
         <w:keepLines/>
         <w:tabs>
-          <w:tab w:val="right" w:leader="dot" w:pos="9360"/>
+          <w:tab w:val="right" w:leader="dot" w:pos="9359"/>
         </w:tabs>
         <w:spacing w:before="144" w:after="0" w:line="322" w:lineRule="exact"/>
         <w:ind w:left="576" w:right="1440" w:hanging="576"/>
@@ -3071,7 +3071,7 @@
       <w:pPr>
         <w:keepLines/>
         <w:tabs>
-          <w:tab w:val="right" w:leader="dot" w:pos="9360"/>
+          <w:tab w:val="right" w:leader="dot" w:pos="9359"/>
         </w:tabs>
         <w:spacing w:before="144" w:after="0" w:line="322" w:lineRule="exact"/>
         <w:ind w:left="576" w:right="1440" w:hanging="576"/>
@@ -3170,7 +3170,7 @@
       <w:pPr>
         <w:keepLines/>
         <w:tabs>
-          <w:tab w:val="right" w:leader="dot" w:pos="9360"/>
+          <w:tab w:val="right" w:leader="dot" w:pos="9359"/>
         </w:tabs>
         <w:spacing w:before="144" w:after="0" w:line="322" w:lineRule="exact"/>
         <w:ind w:left="576" w:right="1440" w:hanging="576"/>
@@ -3277,7 +3277,7 @@
       <w:pPr>
         <w:keepLines/>
         <w:tabs>
-          <w:tab w:val="right" w:leader="dot" w:pos="9360"/>
+          <w:tab w:val="right" w:leader="dot" w:pos="9359"/>
         </w:tabs>
         <w:spacing w:before="144" w:after="0" w:line="322" w:lineRule="exact"/>
         <w:ind w:left="576" w:right="1440" w:hanging="576"/>
@@ -3432,7 +3432,7 @@
       <w:pPr>
         <w:keepLines/>
         <w:tabs>
-          <w:tab w:val="right" w:leader="dot" w:pos="9360"/>
+          <w:tab w:val="right" w:leader="dot" w:pos="9359"/>
         </w:tabs>
         <w:spacing w:before="144" w:after="0" w:line="322" w:lineRule="exact"/>
         <w:ind w:left="576" w:right="1440" w:hanging="576"/>
@@ -3553,7 +3553,7 @@
       <w:pPr>
         <w:keepLines/>
         <w:tabs>
-          <w:tab w:val="right" w:leader="dot" w:pos="9360"/>
+          <w:tab w:val="right" w:leader="dot" w:pos="9359"/>
         </w:tabs>
         <w:spacing w:before="144" w:after="0" w:line="322" w:lineRule="exact"/>
         <w:ind w:left="576" w:right="1440" w:hanging="576"/>
@@ -3674,7 +3674,7 @@
       <w:pPr>
         <w:keepLines/>
         <w:tabs>
-          <w:tab w:val="right" w:leader="dot" w:pos="9360"/>
+          <w:tab w:val="right" w:leader="dot" w:pos="9359"/>
         </w:tabs>
         <w:spacing w:before="144" w:after="0" w:line="322" w:lineRule="exact"/>
         <w:ind w:left="576" w:right="1440" w:hanging="576"/>
@@ -3793,7 +3793,7 @@
       <w:pPr>
         <w:keepLines/>
         <w:tabs>
-          <w:tab w:val="right" w:leader="dot" w:pos="9360"/>
+          <w:tab w:val="right" w:leader="dot" w:pos="9359"/>
         </w:tabs>
         <w:spacing w:before="144" w:after="0" w:line="322" w:lineRule="exact"/>
         <w:ind w:left="576" w:right="1440" w:hanging="576"/>
@@ -3896,7 +3896,7 @@
       <w:pPr>
         <w:keepLines/>
         <w:tabs>
-          <w:tab w:val="right" w:leader="dot" w:pos="9360"/>
+          <w:tab w:val="right" w:leader="dot" w:pos="9359"/>
         </w:tabs>
         <w:spacing w:before="144" w:after="0" w:line="322" w:lineRule="exact"/>
         <w:ind w:left="576" w:right="1440" w:hanging="576"/>
@@ -4005,7 +4005,7 @@
       <w:pPr>
         <w:keepLines/>
         <w:tabs>
-          <w:tab w:val="right" w:leader="dot" w:pos="9360"/>
+          <w:tab w:val="right" w:leader="dot" w:pos="9359"/>
         </w:tabs>
         <w:spacing w:before="144" w:after="0" w:line="322" w:lineRule="exact"/>
         <w:ind w:left="576" w:right="1440" w:hanging="576"/>
@@ -4120,7 +4120,7 @@
       <w:pPr>
         <w:keepLines/>
         <w:tabs>
-          <w:tab w:val="right" w:leader="dot" w:pos="9360"/>
+          <w:tab w:val="right" w:leader="dot" w:pos="9359"/>
         </w:tabs>
         <w:spacing w:before="144" w:after="0" w:line="322" w:lineRule="exact"/>
         <w:ind w:left="576" w:right="1440" w:hanging="576"/>
@@ -4255,7 +4255,7 @@
       <w:pPr>
         <w:keepLines/>
         <w:tabs>
-          <w:tab w:val="right" w:leader="dot" w:pos="9360"/>
+          <w:tab w:val="right" w:leader="dot" w:pos="9359"/>
         </w:tabs>
         <w:spacing w:before="144" w:after="0" w:line="322" w:lineRule="exact"/>
         <w:ind w:left="576" w:right="1440" w:hanging="576"/>
@@ -4366,7 +4366,7 @@
       <w:pPr>
         <w:keepLines/>
         <w:tabs>
-          <w:tab w:val="right" w:leader="dot" w:pos="9360"/>
+          <w:tab w:val="right" w:leader="dot" w:pos="9359"/>
         </w:tabs>
         <w:spacing w:before="144" w:after="0" w:line="322" w:lineRule="exact"/>
         <w:ind w:left="576" w:right="1440" w:hanging="576"/>
@@ -4481,7 +4481,7 @@
       <w:pPr>
         <w:keepLines/>
         <w:tabs>
-          <w:tab w:val="right" w:leader="dot" w:pos="9360"/>
+          <w:tab w:val="right" w:leader="dot" w:pos="9359"/>
         </w:tabs>
         <w:spacing w:before="144" w:after="0" w:line="322" w:lineRule="exact"/>
         <w:ind w:left="576" w:right="1440" w:hanging="576"/>
@@ -4574,7 +4574,7 @@
       <w:pPr>
         <w:keepLines/>
         <w:tabs>
-          <w:tab w:val="right" w:leader="dot" w:pos="9360"/>
+          <w:tab w:val="right" w:leader="dot" w:pos="9359"/>
         </w:tabs>
         <w:spacing w:before="144" w:after="0" w:line="322" w:lineRule="exact"/>
         <w:ind w:left="576" w:right="1440" w:hanging="576"/>
@@ -4655,7 +4655,7 @@
       <w:pPr>
         <w:keepLines/>
         <w:tabs>
-          <w:tab w:val="right" w:leader="dot" w:pos="9360"/>
+          <w:tab w:val="right" w:leader="dot" w:pos="9359"/>
         </w:tabs>
         <w:spacing w:before="144" w:after="0" w:line="322" w:lineRule="exact"/>
         <w:ind w:left="576" w:right="1440" w:hanging="576"/>
@@ -4818,7 +4818,7 @@
       <w:pPr>
         <w:keepLines/>
         <w:tabs>
-          <w:tab w:val="right" w:leader="dot" w:pos="9360"/>
+          <w:tab w:val="right" w:leader="dot" w:pos="9359"/>
         </w:tabs>
         <w:spacing w:before="144" w:after="0" w:line="322" w:lineRule="exact"/>
         <w:ind w:left="576" w:right="1440" w:hanging="576"/>
@@ -4953,7 +4953,7 @@
       <w:pPr>
         <w:keepLines/>
         <w:tabs>
-          <w:tab w:val="right" w:leader="dot" w:pos="9360"/>
+          <w:tab w:val="right" w:leader="dot" w:pos="9359"/>
         </w:tabs>
         <w:spacing w:before="144" w:after="0" w:line="322" w:lineRule="exact"/>
         <w:ind w:left="576" w:right="1440" w:hanging="576"/>
@@ -5046,7 +5046,7 @@
       <w:pPr>
         <w:keepLines/>
         <w:tabs>
-          <w:tab w:val="right" w:leader="dot" w:pos="9360"/>
+          <w:tab w:val="right" w:leader="dot" w:pos="9359"/>
         </w:tabs>
         <w:spacing w:before="144" w:after="0" w:line="322" w:lineRule="exact"/>
         <w:ind w:left="576" w:right="1440" w:hanging="576"/>
@@ -5133,7 +5133,7 @@
       <w:pPr>
         <w:keepLines/>
         <w:tabs>
-          <w:tab w:val="right" w:leader="dot" w:pos="9360"/>
+          <w:tab w:val="right" w:leader="dot" w:pos="9359"/>
         </w:tabs>
         <w:spacing w:before="144" w:after="0" w:line="322" w:lineRule="exact"/>
         <w:ind w:left="576" w:right="1440" w:hanging="576"/>
@@ -5268,7 +5268,7 @@
       <w:pPr>
         <w:keepLines/>
         <w:tabs>
-          <w:tab w:val="right" w:leader="dot" w:pos="9360"/>
+          <w:tab w:val="right" w:leader="dot" w:pos="9359"/>
         </w:tabs>
         <w:spacing w:before="144" w:after="0" w:line="322" w:lineRule="exact"/>
         <w:ind w:left="576" w:right="1440" w:hanging="576"/>
@@ -5403,7 +5403,7 @@
       <w:pPr>
         <w:keepLines/>
         <w:tabs>
-          <w:tab w:val="right" w:leader="dot" w:pos="9360"/>
+          <w:tab w:val="right" w:leader="dot" w:pos="9359"/>
         </w:tabs>
         <w:spacing w:before="144" w:after="0" w:line="322" w:lineRule="exact"/>
         <w:ind w:left="576" w:right="1440" w:hanging="576"/>
@@ -5524,7 +5524,7 @@
       <w:pPr>
         <w:keepLines/>
         <w:tabs>
-          <w:tab w:val="right" w:leader="dot" w:pos="9360"/>
+          <w:tab w:val="right" w:leader="dot" w:pos="9359"/>
         </w:tabs>
         <w:spacing w:before="144" w:after="0" w:line="322" w:lineRule="exact"/>
         <w:ind w:left="576" w:right="1440" w:hanging="576"/>
@@ -5657,7 +5657,7 @@
       <w:pPr>
         <w:keepLines/>
         <w:tabs>
-          <w:tab w:val="right" w:leader="dot" w:pos="9360"/>
+          <w:tab w:val="right" w:leader="dot" w:pos="9359"/>
         </w:tabs>
         <w:spacing w:before="144" w:after="0" w:line="322" w:lineRule="exact"/>
         <w:ind w:left="576" w:right="1440" w:hanging="576"/>
@@ -5744,7 +5744,7 @@
       <w:pPr>
         <w:keepLines/>
         <w:tabs>
-          <w:tab w:val="right" w:leader="dot" w:pos="9360"/>
+          <w:tab w:val="right" w:leader="dot" w:pos="9359"/>
         </w:tabs>
         <w:spacing w:before="144" w:after="0" w:line="322" w:lineRule="exact"/>
         <w:ind w:left="576" w:right="1440" w:hanging="576"/>
@@ -5907,7 +5907,7 @@
       <w:pPr>
         <w:keepLines/>
         <w:tabs>
-          <w:tab w:val="right" w:leader="dot" w:pos="9360"/>
+          <w:tab w:val="right" w:leader="dot" w:pos="9359"/>
         </w:tabs>
         <w:spacing w:before="144" w:after="0" w:line="322" w:lineRule="exact"/>
         <w:ind w:left="576" w:right="1440" w:hanging="576"/>
@@ -6022,7 +6022,7 @@
       <w:pPr>
         <w:keepLines/>
         <w:tabs>
-          <w:tab w:val="right" w:leader="dot" w:pos="9360"/>
+          <w:tab w:val="right" w:leader="dot" w:pos="9359"/>
         </w:tabs>
         <w:spacing w:before="144" w:after="0" w:line="322" w:lineRule="exact"/>
         <w:ind w:left="576" w:right="1440" w:hanging="576"/>
@@ -6103,7 +6103,7 @@
       <w:pPr>
         <w:keepLines/>
         <w:tabs>
-          <w:tab w:val="right" w:leader="dot" w:pos="9360"/>
+          <w:tab w:val="right" w:leader="dot" w:pos="9359"/>
         </w:tabs>
         <w:spacing w:before="144" w:after="0" w:line="322" w:lineRule="exact"/>
         <w:ind w:left="576" w:right="1440" w:hanging="576"/>
@@ -6218,7 +6218,7 @@
       <w:pPr>
         <w:keepLines/>
         <w:tabs>
-          <w:tab w:val="right" w:leader="dot" w:pos="9360"/>
+          <w:tab w:val="right" w:leader="dot" w:pos="9359"/>
         </w:tabs>
         <w:spacing w:before="144" w:after="0" w:line="322" w:lineRule="exact"/>
         <w:ind w:left="576" w:right="1440" w:hanging="576"/>
@@ -6369,7 +6369,7 @@
       <w:pPr>
         <w:keepLines/>
         <w:tabs>
-          <w:tab w:val="right" w:leader="dot" w:pos="9360"/>
+          <w:tab w:val="right" w:leader="dot" w:pos="9359"/>
         </w:tabs>
         <w:spacing w:before="144" w:after="0" w:line="322" w:lineRule="exact"/>
         <w:ind w:left="576" w:right="1440" w:hanging="576"/>
@@ -6490,7 +6490,7 @@
       <w:pPr>
         <w:keepLines/>
         <w:tabs>
-          <w:tab w:val="right" w:leader="dot" w:pos="9360"/>
+          <w:tab w:val="right" w:leader="dot" w:pos="9359"/>
         </w:tabs>
         <w:spacing w:before="144" w:after="0" w:line="322" w:lineRule="exact"/>
         <w:ind w:left="576" w:right="1440" w:hanging="576"/>
@@ -6577,7 +6577,7 @@
       <w:pPr>
         <w:keepLines/>
         <w:tabs>
-          <w:tab w:val="right" w:leader="dot" w:pos="9360"/>
+          <w:tab w:val="right" w:leader="dot" w:pos="9359"/>
         </w:tabs>
         <w:spacing w:before="144" w:after="0" w:line="322" w:lineRule="exact"/>
         <w:ind w:left="576" w:right="1440" w:hanging="576"/>
@@ -6700,7 +6700,7 @@
       <w:pPr>
         <w:keepLines/>
         <w:tabs>
-          <w:tab w:val="right" w:leader="dot" w:pos="9360"/>
+          <w:tab w:val="right" w:leader="dot" w:pos="9359"/>
         </w:tabs>
         <w:spacing w:before="144" w:after="0" w:line="322" w:lineRule="exact"/>
         <w:ind w:left="576" w:right="1440" w:hanging="576"/>
@@ -6793,7 +6793,7 @@
       <w:pPr>
         <w:keepLines/>
         <w:tabs>
-          <w:tab w:val="right" w:leader="dot" w:pos="9360"/>
+          <w:tab w:val="right" w:leader="dot" w:pos="9359"/>
         </w:tabs>
         <w:spacing w:before="144" w:after="0" w:line="322" w:lineRule="exact"/>
         <w:ind w:left="576" w:right="1440" w:hanging="576"/>
@@ -6992,7 +6992,7 @@
       <w:pPr>
         <w:keepLines/>
         <w:tabs>
-          <w:tab w:val="right" w:leader="dot" w:pos="9360"/>
+          <w:tab w:val="right" w:leader="dot" w:pos="9359"/>
         </w:tabs>
         <w:spacing w:before="144" w:after="0" w:line="322" w:lineRule="exact"/>
         <w:ind w:left="576" w:right="1440" w:hanging="576"/>
@@ -7079,7 +7079,7 @@
       <w:pPr>
         <w:keepLines/>
         <w:tabs>
-          <w:tab w:val="right" w:leader="dot" w:pos="9360"/>
+          <w:tab w:val="right" w:leader="dot" w:pos="9359"/>
         </w:tabs>
         <w:spacing w:before="144" w:after="0" w:line="322" w:lineRule="exact"/>
         <w:ind w:left="576" w:right="1440" w:hanging="576"/>
@@ -7202,7 +7202,7 @@
       <w:pPr>
         <w:keepLines/>
         <w:tabs>
-          <w:tab w:val="right" w:leader="dot" w:pos="9360"/>
+          <w:tab w:val="right" w:leader="dot" w:pos="9359"/>
         </w:tabs>
         <w:spacing w:before="144" w:after="0" w:line="322" w:lineRule="exact"/>
         <w:ind w:left="576" w:right="1440" w:hanging="576"/>
@@ -7367,7 +7367,7 @@
       <w:pPr>
         <w:keepLines/>
         <w:tabs>
-          <w:tab w:val="right" w:leader="dot" w:pos="9360"/>
+          <w:tab w:val="right" w:leader="dot" w:pos="9359"/>
         </w:tabs>
         <w:spacing w:before="144" w:after="0" w:line="322" w:lineRule="exact"/>
         <w:ind w:left="576" w:right="1440" w:hanging="576"/>
@@ -7460,7 +7460,7 @@
       <w:pPr>
         <w:keepLines/>
         <w:tabs>
-          <w:tab w:val="right" w:leader="dot" w:pos="9360"/>
+          <w:tab w:val="right" w:leader="dot" w:pos="9359"/>
         </w:tabs>
         <w:spacing w:before="144" w:after="0" w:line="322" w:lineRule="exact"/>
         <w:ind w:left="576" w:right="1440" w:hanging="576"/>
@@ -7569,7 +7569,7 @@
       <w:pPr>
         <w:keepLines/>
         <w:tabs>
-          <w:tab w:val="right" w:leader="dot" w:pos="9360"/>
+          <w:tab w:val="right" w:leader="dot" w:pos="9359"/>
         </w:tabs>
         <w:spacing w:before="144" w:after="0" w:line="322" w:lineRule="exact"/>
         <w:ind w:left="576" w:right="1440" w:hanging="576"/>
@@ -7609,7 +7609,7 @@
       <w:pPr>
         <w:keepLines/>
         <w:tabs>
-          <w:tab w:val="right" w:leader="dot" w:pos="9360"/>
+          <w:tab w:val="right" w:leader="dot" w:pos="9359"/>
         </w:tabs>
         <w:spacing w:before="144" w:after="0" w:line="322" w:lineRule="exact"/>
         <w:ind w:left="576" w:right="1440" w:hanging="576"/>
@@ -7675,7 +7675,7 @@
       <w:pPr>
         <w:keepLines/>
         <w:tabs>
-          <w:tab w:val="right" w:leader="dot" w:pos="9360"/>
+          <w:tab w:val="right" w:leader="dot" w:pos="9359"/>
         </w:tabs>
         <w:spacing w:before="144" w:after="0" w:line="322" w:lineRule="exact"/>
         <w:ind w:left="576" w:right="1440" w:hanging="576"/>
@@ -7759,7 +7759,7 @@
       <w:pPr>
         <w:keepLines/>
         <w:tabs>
-          <w:tab w:val="right" w:leader="dot" w:pos="9360"/>
+          <w:tab w:val="right" w:leader="dot" w:pos="9359"/>
         </w:tabs>
         <w:spacing w:before="144" w:after="0" w:line="322" w:lineRule="exact"/>
         <w:ind w:left="576" w:right="1440" w:hanging="576"/>
@@ -7823,7 +7823,7 @@
       <w:pPr>
         <w:keepLines/>
         <w:tabs>
-          <w:tab w:val="right" w:leader="dot" w:pos="9360"/>
+          <w:tab w:val="right" w:leader="dot" w:pos="9359"/>
         </w:tabs>
         <w:spacing w:before="144" w:after="0" w:line="322" w:lineRule="exact"/>
         <w:ind w:left="576" w:right="1440" w:hanging="576"/>
@@ -7883,7 +7883,7 @@
       <w:pPr>
         <w:keepLines/>
         <w:tabs>
-          <w:tab w:val="right" w:leader="dot" w:pos="9360"/>
+          <w:tab w:val="right" w:leader="dot" w:pos="9359"/>
         </w:tabs>
         <w:spacing w:before="144" w:after="0" w:line="322" w:lineRule="exact"/>
         <w:ind w:left="576" w:right="1440" w:hanging="576"/>
@@ -7947,7 +7947,7 @@
       <w:pPr>
         <w:keepLines/>
         <w:tabs>
-          <w:tab w:val="right" w:leader="dot" w:pos="9360"/>
+          <w:tab w:val="right" w:leader="dot" w:pos="9359"/>
         </w:tabs>
         <w:spacing w:before="144" w:after="0" w:line="322" w:lineRule="exact"/>
         <w:ind w:left="576" w:right="1440" w:hanging="576"/>
@@ -8001,7 +8001,7 @@
       <w:pPr>
         <w:keepLines/>
         <w:tabs>
-          <w:tab w:val="right" w:leader="dot" w:pos="9360"/>
+          <w:tab w:val="right" w:leader="dot" w:pos="9359"/>
         </w:tabs>
         <w:spacing w:before="144" w:after="0" w:line="322" w:lineRule="exact"/>
         <w:ind w:left="576" w:right="1440" w:hanging="576"/>
@@ -8081,7 +8081,7 @@
       <w:pPr>
         <w:keepLines/>
         <w:tabs>
-          <w:tab w:val="right" w:leader="dot" w:pos="9360"/>
+          <w:tab w:val="right" w:leader="dot" w:pos="9359"/>
         </w:tabs>
         <w:spacing w:before="144" w:after="0" w:line="322" w:lineRule="exact"/>
         <w:ind w:left="576" w:right="1440" w:hanging="576"/>
@@ -8133,7 +8133,7 @@
       <w:pPr>
         <w:keepLines/>
         <w:tabs>
-          <w:tab w:val="right" w:leader="dot" w:pos="9360"/>
+          <w:tab w:val="right" w:leader="dot" w:pos="9359"/>
         </w:tabs>
         <w:spacing w:before="144" w:after="0" w:line="322" w:lineRule="exact"/>
         <w:ind w:left="576" w:right="1440" w:hanging="576"/>
@@ -8185,7 +8185,7 @@
       <w:pPr>
         <w:keepLines/>
         <w:tabs>
-          <w:tab w:val="right" w:leader="dot" w:pos="9360"/>
+          <w:tab w:val="right" w:leader="dot" w:pos="9359"/>
         </w:tabs>
         <w:spacing w:before="144" w:after="0" w:line="322" w:lineRule="exact"/>
         <w:ind w:left="576" w:right="1440" w:hanging="576"/>
@@ -8237,7 +8237,7 @@
       <w:pPr>
         <w:keepLines/>
         <w:tabs>
-          <w:tab w:val="right" w:leader="dot" w:pos="9360"/>
+          <w:tab w:val="right" w:leader="dot" w:pos="9359"/>
         </w:tabs>
         <w:spacing w:before="144" w:after="0" w:line="322" w:lineRule="exact"/>
         <w:ind w:left="576" w:right="1440" w:hanging="576"/>
@@ -8321,7 +8321,7 @@
       <w:pPr>
         <w:keepLines/>
         <w:tabs>
-          <w:tab w:val="right" w:leader="dot" w:pos="9360"/>
+          <w:tab w:val="right" w:leader="dot" w:pos="9359"/>
         </w:tabs>
         <w:spacing w:before="144" w:after="0" w:line="322" w:lineRule="exact"/>
         <w:ind w:left="576" w:right="1440" w:hanging="576"/>
@@ -8447,7 +8447,7 @@
       <w:pPr>
         <w:keepLines/>
         <w:tabs>
-          <w:tab w:val="right" w:leader="dot" w:pos="9360"/>
+          <w:tab w:val="right" w:leader="dot" w:pos="9359"/>
         </w:tabs>
         <w:spacing w:before="144" w:after="0" w:line="322" w:lineRule="exact"/>
         <w:ind w:left="576" w:right="1440" w:hanging="576"/>
@@ -8555,7 +8555,7 @@
       <w:pPr>
         <w:keepLines/>
         <w:tabs>
-          <w:tab w:val="right" w:leader="dot" w:pos="9360"/>
+          <w:tab w:val="right" w:leader="dot" w:pos="9359"/>
         </w:tabs>
         <w:spacing w:before="144" w:after="0" w:line="322" w:lineRule="exact"/>
         <w:ind w:left="576" w:right="1440" w:hanging="576"/>
@@ -14236,7 +14236,7 @@
     </w:p>
     <w:tbl>
       <w:tblPr>
-        <w:tblW w:w="9360" w:type="dxa"/>
+        <w:tblW w:w="9359" w:type="dxa"/>
         <w:tblLayout w:type="fixed"/>
         <w:tblCellMar>
           <w:top w:w="0" w:type="dxa"/>
@@ -14247,7 +14247,7 @@
         <w:tblLook w:val="0000" w:firstRow="0" w:lastRow="0" w:firstColumn="0" w:lastColumn="0" w:noHBand="0" w:noVBand="0"/>
       </w:tblPr>
       <w:tblGrid>
-        <w:gridCol w:w="9360"/>
+        <w:gridCol w:w="9359"/>
       </w:tblGrid>
       <w:tr>
         <w:trPr>
@@ -14255,7 +14255,7 @@
         </w:trPr>
         <w:tc>
           <w:tcPr>
-            <w:tcW w:w="9360" w:type="dxa"/>
+            <w:tcW w:w="9359" w:type="dxa"/>
           </w:tcPr>
           <w:p>
             <w:pPr>
@@ -14308,7 +14308,7 @@
           </w:p>
           <w:tbl>
             <w:tblPr>
-              <w:tblW w:w="9360" w:type="dxa"/>
+              <w:tblW w:w="9359" w:type="dxa"/>
               <w:tblLayout w:type="fixed"/>
               <w:tblCellMar>
                 <w:top w:w="0" w:type="dxa"/>
@@ -14319,7 +14319,7 @@
               <w:tblLook w:val="0000" w:firstRow="0" w:lastRow="0" w:firstColumn="0" w:lastColumn="0" w:noHBand="0" w:noVBand="0"/>
             </w:tblPr>
             <w:tblGrid>
-              <w:gridCol w:w="4464"/>
+              <w:gridCol w:w="4463"/>
               <w:gridCol w:w="4896"/>
             </w:tblGrid>
             <w:tr>
@@ -14328,7 +14328,7 @@
               </w:trPr>
               <w:tc>
                 <w:tcPr>
-                  <w:tcW w:w="4464" w:type="dxa"/>
+                  <w:tcW w:w="4463" w:type="dxa"/>
                 </w:tcPr>
                 <w:p>
                   <w:pPr>
@@ -14794,7 +14794,7 @@
     </w:p>
     <w:tbl>
       <w:tblPr>
-        <w:tblW w:w="9360" w:type="dxa"/>
+        <w:tblW w:w="9359" w:type="dxa"/>
         <w:tblLayout w:type="fixed"/>
         <w:tblCellMar>
           <w:top w:w="0" w:type="dxa"/>
@@ -14805,7 +14805,7 @@
         <w:tblLook w:val="0000" w:firstRow="0" w:lastRow="0" w:firstColumn="0" w:lastColumn="0" w:noHBand="0" w:noVBand="0"/>
       </w:tblPr>
       <w:tblGrid>
-        <w:gridCol w:w="4464"/>
+        <w:gridCol w:w="4463"/>
         <w:gridCol w:w="4896"/>
       </w:tblGrid>
       <w:tr>
@@ -14814,7 +14814,7 @@
         </w:trPr>
         <w:tc>
           <w:tcPr>
-            <w:tcW w:w="4464" w:type="dxa"/>
+            <w:tcW w:w="4463" w:type="dxa"/>
           </w:tcPr>
           <w:p>
             <w:pPr>
@@ -14904,7 +14904,7 @@
     </w:p>
     <w:tbl>
       <w:tblPr>
-        <w:tblW w:w="9360" w:type="dxa"/>
+        <w:tblW w:w="9359" w:type="dxa"/>
         <w:tblLayout w:type="fixed"/>
         <w:tblCellMar>
           <w:top w:w="0" w:type="dxa"/>
@@ -14915,7 +14915,7 @@
         <w:tblLook w:val="0000" w:firstRow="0" w:lastRow="0" w:firstColumn="0" w:lastColumn="0" w:noHBand="0" w:noVBand="0"/>
       </w:tblPr>
       <w:tblGrid>
-        <w:gridCol w:w="4464"/>
+        <w:gridCol w:w="4463"/>
         <w:gridCol w:w="4896"/>
       </w:tblGrid>
       <w:tr>
@@ -14924,7 +14924,7 @@
         </w:trPr>
         <w:tc>
           <w:tcPr>
-            <w:tcW w:w="4464" w:type="dxa"/>
+            <w:tcW w:w="4463" w:type="dxa"/>
           </w:tcPr>
           <w:p>
             <w:pPr>
@@ -15066,7 +15066,7 @@
     </w:p>
     <w:tbl>
       <w:tblPr>
-        <w:tblW w:w="9360" w:type="dxa"/>
+        <w:tblW w:w="9359" w:type="dxa"/>
         <w:tblLayout w:type="fixed"/>
         <w:tblCellMar>
           <w:top w:w="0" w:type="dxa"/>
@@ -15077,7 +15077,7 @@
         <w:tblLook w:val="0000" w:firstRow="0" w:lastRow="0" w:firstColumn="0" w:lastColumn="0" w:noHBand="0" w:noVBand="0"/>
       </w:tblPr>
       <w:tblGrid>
-        <w:gridCol w:w="4464"/>
+        <w:gridCol w:w="4463"/>
         <w:gridCol w:w="4896"/>
       </w:tblGrid>
       <w:tr>
@@ -15086,7 +15086,7 @@
         </w:trPr>
         <w:tc>
           <w:tcPr>
-            <w:tcW w:w="4464" w:type="dxa"/>
+            <w:tcW w:w="4463" w:type="dxa"/>
           </w:tcPr>
           <w:p>
             <w:pPr>
@@ -15284,7 +15284,7 @@
     </w:p>
     <w:tbl>
       <w:tblPr>
-        <w:tblW w:w="9360" w:type="dxa"/>
+        <w:tblW w:w="9359" w:type="dxa"/>
         <w:tblLayout w:type="fixed"/>
         <w:tblCellMar>
           <w:top w:w="0" w:type="dxa"/>
@@ -15295,7 +15295,7 @@
         <w:tblLook w:val="0000" w:firstRow="0" w:lastRow="0" w:firstColumn="0" w:lastColumn="0" w:noHBand="0" w:noVBand="0"/>
       </w:tblPr>
       <w:tblGrid>
-        <w:gridCol w:w="4464"/>
+        <w:gridCol w:w="4463"/>
         <w:gridCol w:w="4896"/>
       </w:tblGrid>
       <w:tr>
@@ -15304,7 +15304,7 @@
         </w:trPr>
         <w:tc>
           <w:tcPr>
-            <w:tcW w:w="4464" w:type="dxa"/>
+            <w:tcW w:w="4463" w:type="dxa"/>
           </w:tcPr>
           <w:p>
             <w:pPr>
@@ -15456,7 +15456,7 @@
     </w:p>
     <w:tbl>
       <w:tblPr>
-        <w:tblW w:w="9360" w:type="dxa"/>
+        <w:tblW w:w="9359" w:type="dxa"/>
         <w:tblLayout w:type="fixed"/>
         <w:tblCellMar>
           <w:top w:w="0" w:type="dxa"/>
@@ -15467,7 +15467,7 @@
         <w:tblLook w:val="0000" w:firstRow="0" w:lastRow="0" w:firstColumn="0" w:lastColumn="0" w:noHBand="0" w:noVBand="0"/>
       </w:tblPr>
       <w:tblGrid>
-        <w:gridCol w:w="4464"/>
+        <w:gridCol w:w="4463"/>
         <w:gridCol w:w="4896"/>
       </w:tblGrid>
       <w:tr>
@@ -15476,7 +15476,7 @@
         </w:trPr>
         <w:tc>
           <w:tcPr>
-            <w:tcW w:w="4464" w:type="dxa"/>
+            <w:tcW w:w="4463" w:type="dxa"/>
           </w:tcPr>
           <w:p>
             <w:pPr>
@@ -15748,7 +15748,7 @@
     </w:p>
     <w:tbl>
       <w:tblPr>
-        <w:tblW w:w="9360" w:type="dxa"/>
+        <w:tblW w:w="9359" w:type="dxa"/>
         <w:tblLayout w:type="fixed"/>
         <w:tblCellMar>
           <w:top w:w="0" w:type="dxa"/>
@@ -15759,7 +15759,7 @@
         <w:tblLook w:val="0000" w:firstRow="0" w:lastRow="0" w:firstColumn="0" w:lastColumn="0" w:noHBand="0" w:noVBand="0"/>
       </w:tblPr>
       <w:tblGrid>
-        <w:gridCol w:w="9360"/>
+        <w:gridCol w:w="9359"/>
       </w:tblGrid>
       <w:tr>
         <w:trPr>
@@ -15767,7 +15767,7 @@
         </w:trPr>
         <w:tc>
           <w:tcPr>
-            <w:tcW w:w="9360" w:type="dxa"/>
+            <w:tcW w:w="9359" w:type="dxa"/>
           </w:tcPr>
           <w:p>
             <w:pPr>
@@ -15804,7 +15804,7 @@
           </w:p>
           <w:tbl>
             <w:tblPr>
-              <w:tblW w:w="9360" w:type="dxa"/>
+              <w:tblW w:w="9359" w:type="dxa"/>
               <w:tblLayout w:type="fixed"/>
               <w:tblCellMar>
                 <w:top w:w="0" w:type="dxa"/>
@@ -15815,7 +15815,7 @@
               <w:tblLook w:val="0000" w:firstRow="0" w:lastRow="0" w:firstColumn="0" w:lastColumn="0" w:noHBand="0" w:noVBand="0"/>
             </w:tblPr>
             <w:tblGrid>
-              <w:gridCol w:w="4464"/>
+              <w:gridCol w:w="4463"/>
               <w:gridCol w:w="4896"/>
             </w:tblGrid>
             <w:tr>
@@ -15824,7 +15824,7 @@
               </w:trPr>
               <w:tc>
                 <w:tcPr>
-                  <w:tcW w:w="4464" w:type="dxa"/>
+                  <w:tcW w:w="4463" w:type="dxa"/>
                 </w:tcPr>
                 <w:p>
                   <w:pPr>
@@ -15947,7 +15947,7 @@
       <w:footerReference w:type="default" r:id="rIdXdPage"/>
       <w:footerReference w:type="first" r:id="rIdXdNone"/>
       <w:pgSz w:w="12240" w:h="15840"/>
-      <w:pgMar w:top="1440" w:right="1440" w:bottom="1440" w:left="1440" w:header="720" w:footer="686" w:gutter="0"/>
+      <w:pgMar w:top="1440" w:right="1441" w:bottom="1440" w:left="1440" w:header="720" w:footer="686" w:gutter="0"/>
       <w:titlePg/>
     </w:sectPr>
   </w:body>

</xml_diff>